<commit_message>
Remove em-dashes from all materials
</commit_message>
<xml_diff>
--- a/documents/GlossaContact_Application_Form.docx
+++ b/documents/GlossaContact_Application_Form.docx
@@ -59,7 +59,7 @@
           <w:sz w:val="18"/>
           <w:szCs w:val="18"/>
         </w:rPr>
-        <w:t xml:space="preserve">Faculty of English Language &amp; Literature · National and Kapodistrian University of Athens</w:t>
+        <w:t xml:space="preserve">Faculty of English Language &amp; Literature, National and Kapodistrian University of Athens</w:t>
       </w:r>
     </w:p>
     <w:p>
@@ -88,7 +88,7 @@
           <w:sz w:val="36"/>
           <w:szCs w:val="36"/>
         </w:rPr>
-        <w:t xml:space="preserve">Erasmus+ Internship — Application Form</w:t>
+        <w:t xml:space="preserve">Erasmus+ Internship, Application Form</w:t>
       </w:r>
     </w:p>
     <w:p>
@@ -111,7 +111,7 @@
           <w:sz w:val="20"/>
           <w:szCs w:val="20"/>
         </w:rPr>
-        <w:t xml:space="preserve">Please fill in this form, save as PDF, and send it together with your CV, motivation letter (1 page), and academic transcript to nikolaos.lavidas@gmail.com. All fields marked * are required.</w:t>
+        <w:t xml:space="preserve">Please fill in this form and upload it together with your CV, motivation letter (1 page), and academic transcript through our ErasmusIntern.org listing: research-traineeship-glossacontact-lab. All fields marked * are required.</w:t>
       </w:r>
     </w:p>
     <w:p>
@@ -1072,7 +1072,7 @@
                 <w:sz w:val="16"/>
                 <w:szCs w:val="16"/>
               </w:rPr>
-              <w:t xml:space="preserve">ECTS to be earned (max 15)</w:t>
+              <w:t xml:space="preserve">ECTS to be earned (if applicable)</w:t>
             </w:r>
           </w:p>
           <w:p>
@@ -1158,7 +1158,7 @@
           <w:sz w:val="20"/>
           <w:szCs w:val="20"/>
         </w:rPr>
-        <w:t xml:space="preserve">Research area(s) of interest *  (tick one or more — see §02 of the website)</w:t>
+        <w:t xml:space="preserve">Research area(s) of interest *  (tick one or more)</w:t>
       </w:r>
     </w:p>
     <w:p>
@@ -1180,7 +1180,7 @@
           <w:sz w:val="22"/>
           <w:szCs w:val="22"/>
         </w:rPr>
-        <w:t xml:space="preserve">Diachronic syntax of Greek &amp;/or English</w:t>
+        <w:t xml:space="preserve">Diachronic syntax of Greek and/or English</w:t>
       </w:r>
     </w:p>
     <w:p>
@@ -1202,7 +1202,7 @@
           <w:sz w:val="22"/>
           <w:szCs w:val="22"/>
         </w:rPr>
-        <w:t xml:space="preserve">Language contact &amp; translation philology</w:t>
+        <w:t xml:space="preserve">Language contact and translation philology</w:t>
       </w:r>
     </w:p>
     <w:p>
@@ -1224,7 +1224,7 @@
           <w:sz w:val="22"/>
           <w:szCs w:val="22"/>
         </w:rPr>
-        <w:t xml:space="preserve">Treebanking &amp; corpus annotation (PROIEL)</w:t>
+        <w:t xml:space="preserve">Treebanking and corpus annotation</w:t>
       </w:r>
     </w:p>
     <w:p>
@@ -1246,7 +1246,7 @@
           <w:sz w:val="22"/>
           <w:szCs w:val="22"/>
         </w:rPr>
-        <w:t xml:space="preserve">Bilingualism &amp; heritage languages</w:t>
+        <w:t xml:space="preserve">Bilingualism and heritage languages</w:t>
       </w:r>
     </w:p>
     <w:p>
@@ -1268,7 +1268,7 @@
           <w:sz w:val="22"/>
           <w:szCs w:val="22"/>
         </w:rPr>
-        <w:t xml:space="preserve">Computational philology &amp; digital humanities</w:t>
+        <w:t xml:space="preserve">Computational philology and digital humanities</w:t>
       </w:r>
     </w:p>
     <w:p>
@@ -1355,7 +1355,7 @@
           <w:sz w:val="19"/>
           <w:szCs w:val="19"/>
         </w:rPr>
-        <w:t xml:space="preserve">Self-assess according to the Common European Framework of Reference (A1–C2).</w:t>
+        <w:t xml:space="preserve">Self-assess according to the Common European Framework of Reference (A1, C2).</w:t>
       </w:r>
     </w:p>
     <w:tbl>
@@ -1548,7 +1548,7 @@
                 <w:sz w:val="16"/>
                 <w:szCs w:val="16"/>
               </w:rPr>
-              <w:t xml:space="preserve">Other languages &amp; levels</w:t>
+              <w:t xml:space="preserve">Other languages and levels</w:t>
             </w:r>
           </w:p>
           <w:p>
@@ -1607,7 +1607,7 @@
           <w:sz w:val="20"/>
           <w:szCs w:val="20"/>
         </w:rPr>
-        <w:t xml:space="preserve">Why do you want to do your Erasmus+ internship at GlossaContact Lab?  (3–5 sentences) *</w:t>
+        <w:t xml:space="preserve">Why do you want to do your Erasmus+ internship at GlossaContact Lab?  (3 to 5 sentences) *</w:t>
       </w:r>
     </w:p>
     <w:p>
@@ -1660,7 +1660,7 @@
         <w:pBdr>
           <w:bottom w:val="single" w:color="8A8A8A" w:sz="6" w:space="1"/>
         </w:pBdr>
-        <w:spacing w:after="200"/>
+        <w:spacing w:after="80"/>
       </w:pPr>
       <w:r>
         <w:rPr>
@@ -1743,7 +1743,7 @@
         <w:pBdr>
           <w:bottom w:val="single" w:color="8A8A8A" w:sz="6" w:space="1"/>
         </w:pBdr>
-        <w:spacing w:after="200"/>
+        <w:spacing w:after="80"/>
       </w:pPr>
       <w:r>
         <w:rPr>
@@ -2084,7 +2084,7 @@
           <w:sz w:val="18"/>
           <w:szCs w:val="18"/>
         </w:rPr>
-        <w:t xml:space="preserve">──────────────────────  For office use only  ──────────────────────</w:t>
+        <w:t xml:space="preserve">For office use only</w:t>
       </w:r>
     </w:p>
     <w:tbl>
@@ -2335,16 +2335,7 @@
         <w:sz w:val="16"/>
         <w:szCs w:val="16"/>
       </w:rPr>
-      <w:t xml:space="preserve">  ·  </w:t>
-    </w:r>
-    <w:r>
-      <w:rPr>
-        <w:rFonts w:ascii="Calibri" w:cs="Calibri" w:eastAsia="Calibri" w:hAnsi="Calibri"/>
-        <w:color w:val="8A8A8A"/>
-        <w:sz w:val="16"/>
-        <w:szCs w:val="16"/>
-      </w:rPr>
-      <w:t xml:space="preserve">nikolaos.lavidas@gmail.com</w:t>
+      <w:t xml:space="preserve">  ·  Apply on erasmusintern.org</w:t>
     </w:r>
   </w:p>
 </w:ftr>
@@ -2400,7 +2391,7 @@
         <w:sz w:val="16"/>
         <w:szCs w:val="16"/>
       </w:rPr>
-      <w:t xml:space="preserve">GlossaContact Lab · Erasmus+ Application</w:t>
+      <w:t xml:space="preserve">GlossaContact Lab, Erasmus+ Application</w:t>
     </w:r>
   </w:p>
 </w:hdr>

</xml_diff>